<commit_message>
Agregado el diagrama del divisor del pH y su procedimiento en la guia del sensor
</commit_message>
<xml_diff>
--- a/docs/19_GUIA_DEL_SENSOR_DE_PH.docx
+++ b/docs/19_GUIA_DEL_SENSOR_DE_PH.docx
@@ -669,6 +669,138 @@
     </w:p>
     <w:p>
       <w:pPr>
+        <w:pStyle w:val="Heading2"/>
+      </w:pPr>
+      <w:r>
+        <w:t>3.2 El divisor ÷2 que hay que armar antes de medir</w:t>
+      </w:r>
+    </w:p>
+    <w:p>
+      <w:r>
+        <w:rPr>
+          <w:b w:val="0"/>
+          <w:sz w:val="22"/>
+        </w:rPr>
+        <w:t>La placa PH-4502C se alimenta a 5 V y su salida Po puede acercarse a esa tensión, mientras</w:t>
+      </w:r>
+    </w:p>
+    <w:p>
+      <w:r>
+        <w:rPr>
+          <w:b w:val="0"/>
+          <w:sz w:val="22"/>
+        </w:rPr>
+        <w:t>que el ESP32 tolera 3,3 V en sus entradas. Entre Po y el pin SVP (GPIO 36) va un divisor</w:t>
+      </w:r>
+    </w:p>
+    <w:p>
+      <w:r>
+        <w:rPr>
+          <w:b w:val="0"/>
+          <w:sz w:val="22"/>
+        </w:rPr>
+        <w:t>con dos resistencias iguales de 4,7 kΩ:</w:t>
+      </w:r>
+    </w:p>
+    <w:p>
+      <w:pPr>
+        <w:ind w:left="360"/>
+        <w:shd w:val="clear" w:fill="F2F2F2"/>
+      </w:pPr>
+      <w:r>
+        <w:rPr>
+          <w:rFonts w:ascii="Consolas" w:hAnsi="Consolas"/>
+          <w:b w:val="0"/>
+          <w:color w:val="1F3B73"/>
+          <w:sz w:val="18"/>
+        </w:rPr>
+        <w:t>Po (PH-4502C) ---[ 4,7 kΩ ]---+--- SVP (GPIO 36)</w:t>
+        <w:br/>
+        <w:t xml:space="preserve">                              |</w:t>
+        <w:br/>
+        <w:t xml:space="preserve">                          [ 4,7 kΩ ]</w:t>
+        <w:br/>
+        <w:t xml:space="preserve">                              |</w:t>
+        <w:br/>
+        <w:t xml:space="preserve">                             GND</w:t>
+      </w:r>
+    </w:p>
+    <w:p/>
+    <w:p>
+      <w:r>
+        <w:rPr>
+          <w:b w:val="0"/>
+          <w:sz w:val="22"/>
+        </w:rPr>
+        <w:t>El punto del medio es el nodo: ahí se juntan la primera resistencia, la segunda y el cable al</w:t>
+      </w:r>
+    </w:p>
+    <w:p>
+      <w:r>
+        <w:rPr>
+          <w:b w:val="0"/>
+          <w:sz w:val="22"/>
+        </w:rPr>
+        <w:t>SVP, los tres en el mismo punto. La masa tiene que ser común a la placa del pH y al ESP32.</w:t>
+      </w:r>
+    </w:p>
+    <w:p>
+      <w:r>
+        <w:rPr>
+          <w:b w:val="0"/>
+          <w:sz w:val="22"/>
+        </w:rPr>
+        <w:t>Comprobación con el multímetro antes de conectar: entre Po y GND debe dar unos 9,4 kΩ</w:t>
+      </w:r>
+    </w:p>
+    <w:p>
+      <w:r>
+        <w:rPr>
+          <w:b w:val="0"/>
+          <w:sz w:val="22"/>
+        </w:rPr>
+        <w:t>(las dos resistencias en serie), entre el nodo y GND unos 4,7 kΩ, y con el módulo encendido y el</w:t>
+      </w:r>
+    </w:p>
+    <w:p>
+      <w:r>
+        <w:rPr>
+          <w:b w:val="0"/>
+          <w:sz w:val="22"/>
+        </w:rPr>
+        <w:t>electrodo en el patrón, el nodo debe dar la mitad de lo que hay en Po.</w:t>
+      </w:r>
+    </w:p>
+    <w:p>
+      <w:r>
+        <w:rPr>
+          <w:b w:val="0"/>
+          <w:sz w:val="22"/>
+        </w:rPr>
+        <w:t>El procedimiento dibujado, con los siete pasos y la tabla de comprobaciones, está en</w:t>
+      </w:r>
+    </w:p>
+    <w:p>
+      <w:r>
+        <w:rPr>
+          <w:b w:val="0"/>
+          <w:sz w:val="22"/>
+        </w:rPr>
+        <w:t>Figuras/23-divisor-ph.png.</w:t>
+      </w:r>
+    </w:p>
+    <w:p>
+      <w:r>
+        <w:rPr>
+          <w:b w:val="0"/>
+          <w:color w:val="555555"/>
+          <w:sz w:val="18"/>
+        </w:rPr>
+        <w:t>____________________________________________________________</w:t>
+      </w:r>
+    </w:p>
+    <w:p>
+      <w:pPr>
         <w:pStyle w:val="Heading1"/>
       </w:pPr>
       <w:r>
@@ -863,6 +995,319 @@
           <w:sz w:val="22"/>
         </w:rPr>
         <w:t>mismo día. Si venden la sonda sola, esa es la compra; si no, el kit completo.</w:t>
+      </w:r>
+    </w:p>
+    <w:p>
+      <w:pPr>
+        <w:pStyle w:val="Heading2"/>
+      </w:pPr>
+      <w:r>
+        <w:t>4.1 Cuándo se revisa y qué número se espera</w:t>
+      </w:r>
+    </w:p>
+    <w:p>
+      <w:r>
+        <w:rPr>
+          <w:b w:val="0"/>
+          <w:sz w:val="22"/>
+        </w:rPr>
+        <w:t>El remojo empezó el lunes 28/09 a las 19:52 en patrón de pH 4,00. De ahí salen los dos</w:t>
+      </w:r>
+    </w:p>
+    <w:p>
+      <w:r>
+        <w:rPr>
+          <w:b w:val="0"/>
+          <w:sz w:val="22"/>
+        </w:rPr>
+        <w:t>momentos:</w:t>
+      </w:r>
+    </w:p>
+    <w:tbl>
+      <w:tblPr>
+        <w:tblStyle w:val="TableGrid"/>
+        <w:tblW w:type="auto" w:w="0"/>
+        <w:jc w:val="center"/>
+        <w:tblLook w:firstColumn="1" w:firstRow="1" w:lastColumn="0" w:lastRow="0" w:noHBand="0" w:noVBand="1" w:val="04A0"/>
+      </w:tblPr>
+      <w:tblGrid>
+        <w:gridCol w:w="2880"/>
+        <w:gridCol w:w="2880"/>
+        <w:gridCol w:w="2880"/>
+      </w:tblGrid>
+      <w:tr>
+        <w:tc>
+          <w:tcPr>
+            <w:tcW w:type="dxa" w:w="2880"/>
+          </w:tcPr>
+          <w:p>
+            <w:r>
+              <w:rPr>
+                <w:b/>
+                <w:sz w:val="20"/>
+              </w:rPr>
+              <w:t>Momento</w:t>
+            </w:r>
+          </w:p>
+        </w:tc>
+        <w:tc>
+          <w:tcPr>
+            <w:tcW w:type="dxa" w:w="2880"/>
+          </w:tcPr>
+          <w:p>
+            <w:r>
+              <w:rPr>
+                <w:b/>
+                <w:sz w:val="20"/>
+              </w:rPr>
+              <w:t>Cuándo</w:t>
+            </w:r>
+          </w:p>
+        </w:tc>
+        <w:tc>
+          <w:tcPr>
+            <w:tcW w:type="dxa" w:w="2880"/>
+          </w:tcPr>
+          <w:p>
+            <w:r>
+              <w:rPr>
+                <w:b/>
+                <w:sz w:val="20"/>
+              </w:rPr>
+              <w:t>Qué se hace</w:t>
+            </w:r>
+          </w:p>
+        </w:tc>
+      </w:tr>
+      <w:tr>
+        <w:tc>
+          <w:tcPr>
+            <w:tcW w:type="dxa" w:w="2880"/>
+          </w:tcPr>
+          <w:p>
+            <w:r>
+              <w:rPr>
+                <w:b w:val="0"/>
+                <w:sz w:val="20"/>
+              </w:rPr>
+              <w:t>Las 24 horas</w:t>
+            </w:r>
+          </w:p>
+        </w:tc>
+        <w:tc>
+          <w:tcPr>
+            <w:tcW w:type="dxa" w:w="2880"/>
+          </w:tcPr>
+          <w:p>
+            <w:r>
+              <w:rPr>
+                <w:b w:val="0"/>
+                <w:sz w:val="20"/>
+              </w:rPr>
+              <w:t>martes 29/09 a las 19:52</w:t>
+            </w:r>
+          </w:p>
+        </w:tc>
+        <w:tc>
+          <w:tcPr>
+            <w:tcW w:type="dxa" w:w="2880"/>
+          </w:tcPr>
+          <w:p>
+            <w:r>
+              <w:rPr>
+                <w:b w:val="0"/>
+                <w:sz w:val="20"/>
+              </w:rPr>
+              <w:t>Revisión rápida: que el bulbo esté húmedo y brillante y la lectura quieta. Todavía no se decide nada</w:t>
+            </w:r>
+          </w:p>
+        </w:tc>
+      </w:tr>
+      <w:tr>
+        <w:tc>
+          <w:tcPr>
+            <w:tcW w:type="dxa" w:w="2880"/>
+          </w:tcPr>
+          <w:p>
+            <w:r>
+              <w:rPr>
+                <w:b w:val="0"/>
+                <w:sz w:val="20"/>
+              </w:rPr>
+              <w:t>Las 48 horas</w:t>
+            </w:r>
+          </w:p>
+        </w:tc>
+        <w:tc>
+          <w:tcPr>
+            <w:tcW w:type="dxa" w:w="2880"/>
+          </w:tcPr>
+          <w:p>
+            <w:r>
+              <w:rPr>
+                <w:b w:val="0"/>
+                <w:sz w:val="20"/>
+              </w:rPr>
+              <w:t>miércoles 30/09 a las 19:52</w:t>
+            </w:r>
+          </w:p>
+        </w:tc>
+        <w:tc>
+          <w:tcPr>
+            <w:tcW w:type="dxa" w:w="2880"/>
+          </w:tcPr>
+          <w:p>
+            <w:r>
+              <w:rPr>
+                <w:b w:val="0"/>
+                <w:sz w:val="20"/>
+              </w:rPr>
+              <w:t>Prueba de los dos patrones y decisión: si no revive, se compra la sonda el mismo día</w:t>
+            </w:r>
+          </w:p>
+        </w:tc>
+      </w:tr>
+    </w:tbl>
+    <w:p/>
+    <w:p>
+      <w:r>
+        <w:rPr>
+          <w:b w:val="0"/>
+          <w:sz w:val="22"/>
+        </w:rPr>
+        <w:t>Qué número se espera. Un electrodo sano entrega unos 59 mV por unidad de pH a 25 °C, así</w:t>
+      </w:r>
+    </w:p>
+    <w:p>
+      <w:r>
+        <w:rPr>
+          <w:b w:val="0"/>
+          <w:sz w:val="22"/>
+        </w:rPr>
+        <w:t>que entre el patrón de 4,00 y el de 6,86 la diferencia debe rondar los 168 mV, y el patrón de</w:t>
+      </w:r>
+    </w:p>
+    <w:p>
+      <w:r>
+        <w:rPr>
+          <w:b w:val="0"/>
+          <w:sz w:val="22"/>
+        </w:rPr>
+        <w:t>4,00 es el que da la tensión más alta. No hace falta que dé exacto, pero sí que la diferencia</w:t>
+      </w:r>
+    </w:p>
+    <w:p>
+      <w:r>
+        <w:rPr>
+          <w:b w:val="0"/>
+          <w:sz w:val="22"/>
+        </w:rPr>
+        <w:t>sea del orden de los cientos de mV y en ese sentido.</w:t>
+      </w:r>
+    </w:p>
+    <w:p>
+      <w:r>
+        <w:rPr>
+          <w:b w:val="0"/>
+          <w:sz w:val="22"/>
+        </w:rPr>
+        <w:t>Si la diferencia es de unas decenas de mV, si sale invertida, o si el valor se mueve solo, la</w:t>
+      </w:r>
+    </w:p>
+    <w:p>
+      <w:r>
+        <w:rPr>
+          <w:b w:val="0"/>
+          <w:sz w:val="22"/>
+        </w:rPr>
+        <w:t>membrana no revivió: por más horas de remojo no va a mejorar, y la compra es la salida.</w:t>
+      </w:r>
+    </w:p>
+    <w:p>
+      <w:r>
+        <w:rPr>
+          <w:b w:val="0"/>
+          <w:sz w:val="22"/>
+        </w:rPr>
+        <w:t>Dos advertencias sobre ese número:</w:t>
+      </w:r>
+    </w:p>
+    <w:p>
+      <w:pPr>
+        <w:pStyle w:val="ListBullet"/>
+      </w:pPr>
+      <w:r>
+        <w:rPr>
+          <w:b w:val="0"/>
+          <w:sz w:val="22"/>
+        </w:rPr>
+        <w:t>Si el divisor de tensión (las dos resistencias de 4,7 kΩ) ya está armado, todas las</w:t>
+      </w:r>
+    </w:p>
+    <w:p>
+      <w:r>
+        <w:rPr>
+          <w:b w:val="0"/>
+          <w:sz w:val="22"/>
+        </w:rPr>
+        <w:t>tensiones se ven a la mitad. Lo que se compara es la diferencia por unidad de pH, no el</w:t>
+      </w:r>
+    </w:p>
+    <w:p>
+      <w:r>
+        <w:rPr>
+          <w:b w:val="0"/>
+          <w:sz w:val="22"/>
+        </w:rPr>
+        <w:t>valor absoluto.</w:t>
+      </w:r>
+    </w:p>
+    <w:p>
+      <w:pPr>
+        <w:pStyle w:val="ListBullet"/>
+      </w:pPr>
+      <w:r>
+        <w:rPr>
+          <w:b w:val="0"/>
+          <w:sz w:val="22"/>
+        </w:rPr>
+        <w:t>La placa PH-4502C puede amplificar la señal del electrodo. Si amplifica, la diferencia será</w:t>
+      </w:r>
+    </w:p>
+    <w:p>
+      <w:r>
+        <w:rPr>
+          <w:b w:val="0"/>
+          <w:sz w:val="22"/>
+        </w:rPr>
+        <w:t>proporcionalmente mayor, y eso no es mejor señal: el criterio que manda sigue siendo la</w:t>
+      </w:r>
+    </w:p>
+    <w:p>
+      <w:r>
+        <w:rPr>
+          <w:b w:val="0"/>
+          <w:sz w:val="22"/>
+        </w:rPr>
+        <w:t>calibración con los tres patrones.</w:t>
+      </w:r>
+    </w:p>
+    <w:p>
+      <w:r>
+        <w:rPr>
+          <w:b w:val="0"/>
+          <w:sz w:val="22"/>
+        </w:rPr>
+        <w:t>Mientras se espera, no tocar nada: el electrodo quieto, tapado, lejos del sol y del calor, y</w:t>
+      </w:r>
+    </w:p>
+    <w:p>
+      <w:r>
+        <w:rPr>
+          <w:b w:val="0"/>
+          <w:sz w:val="22"/>
+        </w:rPr>
+        <w:t>sin cambiarle el líquido. El agua desionizada sirve para enjuagar, nunca para guardarlo.</w:t>
       </w:r>
     </w:p>
     <w:p>

</xml_diff>

<commit_message>
Agregado el diagrama de donde van las resistencias del divisor en la placa del pH
</commit_message>
<xml_diff>
--- a/docs/19_GUIA_DEL_SENSOR_DE_PH.docx
+++ b/docs/19_GUIA_DEL_SENSOR_DE_PH.docx
@@ -786,7 +786,34 @@
           <w:b w:val="0"/>
           <w:sz w:val="22"/>
         </w:rPr>
-        <w:t>Figuras/23-divisor-ph.png.</w:t>
+        <w:t>Figuras/23-divisor-ph.png, y el lugar físico donde va sobre la placa, con el orden real de los</w:t>
+      </w:r>
+    </w:p>
+    <w:p>
+      <w:r>
+        <w:rPr>
+          <w:b w:val="0"/>
+          <w:sz w:val="22"/>
+        </w:rPr>
+        <w:t>seis pines del conector (TO · DO · PO · GND · GND · VCC), en Figuras/24-divisor-ph-donde.png.</w:t>
+      </w:r>
+    </w:p>
+    <w:p>
+      <w:r>
+        <w:rPr>
+          <w:b w:val="0"/>
+          <w:sz w:val="22"/>
+        </w:rPr>
+        <w:t>El divisor se arma del lado del conector de 6 pines, entre PO y uno de los dos GND; el</w:t>
+      </w:r>
+    </w:p>
+    <w:p>
+      <w:r>
+        <w:rPr>
+          <w:b w:val="0"/>
+          <w:sz w:val="22"/>
+        </w:rPr>
+        <w:t>BNC de la derecha es solo para enchufar el electrodo y de ese lado no se suelda nada.</w:t>
       </w:r>
     </w:p>
     <w:p>

</xml_diff>

<commit_message>
Aclarado en la guia del pH que el divisor va del lado del ESP32 y no del lado de la sonda
</commit_message>
<xml_diff>
--- a/docs/19_GUIA_DEL_SENSOR_DE_PH.docx
+++ b/docs/19_GUIA_DEL_SENSOR_DE_PH.docx
@@ -742,6 +742,80 @@
           <w:sz w:val="22"/>
         </w:rPr>
         <w:t>SVP, los tres en el mismo punto. La masa tiene que ser común a la placa del pH y al ESP32.</w:t>
+      </w:r>
+    </w:p>
+    <w:p>
+      <w:r>
+        <w:rPr>
+          <w:b w:val="0"/>
+          <w:sz w:val="22"/>
+        </w:rPr>
+        <w:t>Va del lado que va al ESP32, no del lado de la sonda. El electrodo se enchufa al BNC y su</w:t>
+      </w:r>
+    </w:p>
+    <w:p>
+      <w:r>
+        <w:rPr>
+          <w:b w:val="0"/>
+          <w:sz w:val="22"/>
+        </w:rPr>
+        <w:t>señal la acondiciona la propia placa; lo que hay que bajar es la salida de la placa antes de que</w:t>
+      </w:r>
+    </w:p>
+    <w:p>
+      <w:r>
+        <w:rPr>
+          <w:b w:val="0"/>
+          <w:sz w:val="22"/>
+        </w:rPr>
+        <w:t>entre al microcontrolador:</w:t>
+      </w:r>
+    </w:p>
+    <w:p>
+      <w:pPr>
+        <w:ind w:left="360"/>
+        <w:shd w:val="clear" w:fill="F2F2F2"/>
+      </w:pPr>
+      <w:r>
+        <w:rPr>
+          <w:rFonts w:ascii="Consolas" w:hAnsi="Consolas"/>
+          <w:b w:val="0"/>
+          <w:color w:val="1F3B73"/>
+          <w:sz w:val="18"/>
+        </w:rPr>
+        <w:t>[electrodo] ──BNC──&gt; [placa PH-4502C] ──PO──&gt; [divisor] ──&gt; SVP · GPIO 36</w:t>
+        <w:br/>
+        <w:t xml:space="preserve">   lado de la sonda                                ↑</w:t>
+        <w:br/>
+        <w:t xml:space="preserve">                                    acá va el divisor: del lado del ESP32</w:t>
+      </w:r>
+    </w:p>
+    <w:p/>
+    <w:p>
+      <w:r>
+        <w:rPr>
+          <w:b w:val="0"/>
+          <w:sz w:val="22"/>
+        </w:rPr>
+        <w:t>Del lado del BNC no se suelda nada. Y el divisor no tiene que quedar pegado al pin del conector:</w:t>
+      </w:r>
+    </w:p>
+    <w:p>
+      <w:r>
+        <w:rPr>
+          <w:b w:val="0"/>
+          <w:sz w:val="22"/>
+        </w:rPr>
+        <w:t>sirve en cualquier punto del cable que va de PO al GPIO 36, siempre que la pata de la segunda</w:t>
+      </w:r>
+    </w:p>
+    <w:p>
+      <w:r>
+        <w:rPr>
+          <w:b w:val="0"/>
+          <w:sz w:val="22"/>
+        </w:rPr>
+        <w:t>resistencia llegue al GND de la placa y ese GND sea el mismo del ESP32.</w:t>
       </w:r>
     </w:p>
     <w:p>

</xml_diff>